<commit_message>
Split single-tenant migration timeline: add Glue PySpark ingestor phase (5B+ row initial load)
</commit_message>
<xml_diff>
--- a/Adrian_Malong_Resume.docx
+++ b/Adrian_Malong_Resume.docx
@@ -201,7 +201,7 @@
           <w:rFonts w:ascii="Arial" w:hAnsi="Arial"/>
           <w:sz w:val="19"/>
         </w:rPr>
-        <w:t>Apache Airflow, Amazon MWAA, dbt, Apache Iceberg, ECS Fargate, Parquet, ETL/ELT, incremental processing, dimensional modeling</w:t>
+        <w:t>Apache Airflow, Amazon MWAA, dbt, Apache Iceberg, PySpark, AWS Glue, ECS Fargate, Parquet, ETL/ELT, incremental processing, dimensional modeling</w:t>
       </w:r>
     </w:p>
     <w:p>
@@ -402,7 +402,7 @@
           <w:color w:val="3A3A3A"/>
           <w:sz w:val="19"/>
         </w:rPr>
-        <w:t xml:space="preserve">Single-Tenant Platform Migration  |  Q4 2023 - Q2 2024</w:t>
+        <w:t xml:space="preserve">Single-Tenant Platform Migration  |  Q4 2023 - Q1 2024</w:t>
       </w:r>
     </w:p>
     <w:p>
@@ -433,6 +433,38 @@
           <w:sz w:val="19"/>
         </w:rPr>
         <w:t xml:space="preserve">• Scoped the customization to run on roughly $25K/year in infrastructure costs with only about 4 hours per month of ongoing data engineering support, well below the overhead of a standard multi-tenant deployment.</w:t>
+      </w:r>
+    </w:p>
+    <w:p>
+      <w:pPr>
+        <w:spacing w:before="34" w:after="4" w:line="240" w:lineRule="auto"/>
+        <w:widowControl w:val="0"/>
+        <w:keepNext/>
+      </w:pPr>
+      <w:r>
+        <w:rPr>
+          <w:rFonts w:ascii="Arial" w:hAnsi="Arial"/>
+          <w:b/>
+          <w:i/>
+          <w:color w:val="3A3A3A"/>
+          <w:sz w:val="19"/>
+        </w:rPr>
+        <w:t xml:space="preserve">Glue PySpark Ingestor  |  Q1 2024 - Q2 2024</w:t>
+      </w:r>
+    </w:p>
+    <w:p>
+      <w:pPr>
+        <w:pStyle w:val="ResumeBullet"/>
+        <w:spacing w:before="0" w:after="22" w:line="246" w:lineRule="auto"/>
+        <w:widowControl w:val="0"/>
+        <w:keepLines/>
+      </w:pPr>
+      <w:r>
+        <w:rPr>
+          <w:rFonts w:ascii="Arial" w:hAnsi="Arial"/>
+          <w:sz w:val="19"/>
+        </w:rPr>
+        <w:t xml:space="preserve">• Replaced an underperforming Python-based ingestor with a PySpark job on AWS Glue after it proved too slow for the client’s initial historical load, enabling ingestion of 5B+ rows into Kernel within a practical timeframe.</w:t>
       </w:r>
     </w:p>
     <w:p>

</xml_diff>